<commit_message>
docs: align practicum guide with four new case studies
Co-Authored-By: Codex <noreply@openai.com>
</commit_message>
<xml_diff>
--- a/Docs/konspekt_praktikum_5_6.docx
+++ b/Docs/konspekt_praktikum_5_6.docx
@@ -33,12 +33,12 @@
     </w:p>
     <w:p>
       <w:r>
-        <w:t>Откройте страницу практикума, DeepSeek, Алису AI, GigaChat и ChatGPT. DeepSeek используем для показа первичной настройки. Слабый и улучшенный запрос о принтере сравниваем в Алисе AI, GigaChat и ChatGPT. Для кейса о заявках получаем три формата в одном сервисе, затем сравниваем один из форматов в двух остальных. Остальные кейсы показываем в одном доступном сервисе, чтобы уложиться в 90 минут.</w:t>
+        <w:t>Откройте страницу практикума, DeepSeek, Алису AI, GigaChat и ChatGPT. DeepSeek используем для показа первичной настройки. Слабый и улучшенный запрос о сравнении оборудования проверяем в Алисе AI, GigaChat и ChatGPT. При необходимости DeepSeek заменяет недоступный сервис; замену фиксируем. Для кейса о заявках получаем три формата в одном сервисе, затем сравниваем один из форматов в двух остальных. Остальные кейсы показываем в одном доступном сервисе, чтобы уложиться в 90 минут.</w:t>
       </w:r>
     </w:p>
     <w:p>
       <w:r>
-        <w:t>Скачайте архив. В папке cases находятся пять исходников в DOCX и TXT. Все полностью вымышлены: printer — записка, report — отчёт, requests — порядок заявок, versions — две редакции, weeks — недельный план. В запросах на странице исходники уже включены. Файл можно показать слушателям отдельно; при копировании полного запроса прикреплять тот же документ повторно не требуется. Если демонстрируете загрузку DOCX, проверьте, что сервис действительно прочитал файл. При недоступной загрузке вставьте TXT.</w:t>
+        <w:t>Скачайте архив. В папке cases восемь исходников в DOCX и TXT: equipment — сравнение оборудования; technical_spec — проверка ТЗ; fact_check — проверка справки; work_notes — заметки в план; report — отчёт; requests — заявки; versions — редакции; weeks — недельный план. Все данные придуманы. В копируемом запросе нет отдельной длинной декларации об учебных данных; это пояснение находится на странице. Исходник уже включён в полный запрос, прикреплять его повторно не требуется. При демонстрации вложения проверьте, что сервис прочитал документ; иначе вставьте TXT.</w:t>
       </w:r>
     </w:p>
     <w:p>
@@ -56,12 +56,12 @@
     </w:p>
     <w:p>
       <w:r>
-        <w:t>Пояснение: «Сегодня работаем с ситуациями, похожими на повседневные задачи: записка, отчёт, изменения порядка, график. Данные придуманы для занятия. Сначала уточняем запрос, затем меняем форму результата под адресата. Сервис может написать убедительно, но мы будем проверять конкретные условия».</w:t>
+        <w:t>Пояснение: «Сегодня сравним оборудование, уточняя запрос. Также доступны проверка ТЗ, проверка фактов и превращение заметок в план. Затем меняем форму результата под адресата на других материалах. Сервис может написать убедительно, но мы проверяем конкретные условия».</w:t>
       </w:r>
     </w:p>
     <w:p>
       <w:r>
-        <w:t>Покажите единственный титульный слайд и таблицу времени. Спросите, какой из пяти жанров чаще встречается слушателям. При молчании: «Начнём с записки: важно отделить наблюдения от просьбы принять решение». Объясните, что подробные исходники остаются для самостоятельной работы. На занятии не нужно читать каждый абзац вслух.</w:t>
+        <w:t>Покажите титульный слайд и таблицу времени. Спросите, какая из четырёх новых задач чаще встречается слушателям. При молчании: «Начнём со сравнения трёх моделей: низкая цена ещё не означает соответствие требованиям». На основной разбор отведено 20 минут. Другой новый кейс можно взять вместо сравнения, но не добавлять все три сверху. Подробные исходники остаются для самостоятельной работы.</w:t>
       </w:r>
     </w:p>
     <w:p>
@@ -102,22 +102,22 @@
         <w:pStyle w:val="Heading2"/>
       </w:pPr>
       <w:r>
-        <w:t>15–19 минут. Записка: изучаем исходник</w:t>
+        <w:t>15–19 минут. Оборудование: изучаем исходник</w:t>
       </w:r>
     </w:p>
     <w:p>
       <w:r>
-        <w:t>Откройте printer.docx. Покажите разделы 2, 3 и 5. Есть 6000 страниц, 6 эпизодов и 11 часов недоступности принтера; обслуживание обошлось в 8000 рублей. Нет диагноза неремонтопригодности, цены нового устройства, согласования и бюджета.</w:t>
+        <w:t>Откройте equipment.docx. Покажите обязательные условия: не менее 40 страниц в минуту в одинаковом режиме, поставка до 25 календарных дней, гарантия от 24 месяцев. Затем три предложения и отдельную стоимость доставки. Веса критериев и бюджет не заданы.</w:t>
       </w:r>
     </w:p>
     <w:p>
       <w:r>
-        <w:t>Пояснение: «Наша задача — попросить рассмотреть решение. Нельзя написать, что закупка уже согласована или доказана окупаемость. Одиннадцать часов недоступности принтера не равны одиннадцати часам простоя каждого работника».</w:t>
+        <w:t>Пояснение: «Сначала проверяем допуск по обязательным условиям, потом сравниваем допустимые варианты. Ватты — мощность; киловатт-часы — энергия за время. Эти величины нельзя подменять».</w:t>
       </w:r>
     </w:p>
     <w:p>
       <w:r>
-        <w:t>Спросите, какой факт опасно преувеличить. При молчании укажите на 11 часов и 12 сотрудников: умножение без данных о фактическом ожидании необоснованно.</w:t>
+        <w:t>Спросите, можно ли выбрать самый дешёвый вариант сразу. При молчании покажите срок и гарантию предложения В. Слова о возможном улучшении условий не означают согласованные условия.</w:t>
       </w:r>
     </w:p>
     <w:p>
@@ -130,12 +130,12 @@
     </w:p>
     <w:p>
       <w:r>
-        <w:t>Скопируйте блок «Напиши записку о замене принтера» вместе со справкой в три новых чата. Покажите по одной характерной фразе из ответов. Если модель придумала цену, диагноз или согласование — найдите отсутствие основания в исходнике. Если ответ аккуратен, отметьте это: слабый запрос не обязан приводить к ошибке.</w:t>
+        <w:t>Скопируйте блок «Сравни три модели и выбери лучшую» вместе с исходником в три новых чата. Сначала отправьте запросы, затем разбирайте ответы. Проверьте доставку, допуск и основание выбора. Если ответ аккуратен, отметьте это: слабый запрос не обязан приводить к ошибке.</w:t>
       </w:r>
     </w:p>
     <w:p>
       <w:r>
-        <w:t>Резервный авторский пример ошибки: «Принтер неремонтопригоден, его простой стоил группе 132 рабочих часа, поэтому необходимо немедленно купить новый за 50 000 рублей». Объясните, что это специально составленный пример, а не реальный ответ сервиса. Все три выделенных утверждения не подтверждены.</w:t>
+        <w:t>Резервный авторский пример ошибки: «Выбираем В: 165 000 рублей и самая низкая мощность». Это не ответ реальной модели, а пример для разбора. Не учтена доставка; не соблюдены обязательные срок и гарантия; мощность не равна полной стоимости владения.</w:t>
       </w:r>
     </w:p>
     <w:p>
@@ -148,12 +148,12 @@
     </w:p>
     <w:p>
       <w:r>
-        <w:t>Покажите слайд и конструктор. Цель — проект записки; контекст — факты справки и руководитель как адресат; роль — редактор; ограничения — без выдуманного бюджета, диагноза и согласования; результат — ситуация, факты, просьба, вопросы до 180 слов.</w:t>
+        <w:t>Покажите конструктор. Цель — сравнить три предложения; контекст — обязательные условия и предложения; роль — аналитик; ограничения — без выдуманных весов, бюджета и договорённостей; результат — таблица пяти критериев, полная цена, допуск, условные рекомендации и вопросы.</w:t>
       </w:r>
     </w:p>
     <w:p>
       <w:r>
-        <w:t>Нажмите «Собрать». Покажите, что исходник добавлен автоматически. Спросите, какое ограничение слушатель добавил бы первым. При молчании: «Не объявлять закупку утверждённой». Роль не заменяет факты и не предоставляет полномочий.</w:t>
+        <w:t>Нажмите «Собрать». Исходник добавляется автоматически, но готового ключа в запросе нет. Спросите, какое ограничение добавить первым. При молчании: «Не выбирать победителя по придуманным весам». Роль не заменяет факты и не предоставляет полномочий.</w:t>
       </w:r>
     </w:p>
     <w:p>
@@ -171,12 +171,64 @@
     </w:p>
     <w:p>
       <w:r>
-        <w:t>Авторский ориентир: «За четыре недели зарегистрированы шесть эпизодов недоступности П-01 общей длительностью 11 часов. Выполнены два обслуживания стоимостью 8000 рублей. Прошу рассмотреть варианты дальнейшего обслуживания и замены. Для решения нужны техническое заключение, требования и предложения по стоимости». Это один допустимый черновик, не обязательный эталон формулировки.</w:t>
+        <w:t>Ключ для сверки: полная начальная цена А — 192 000 руб., Б — 210 000 руб., В — 180 000 руб. А и Б соответствуют обязательным условиям, В — нет. При 1000 часах активной работы энергия составляет 80/120/65 кВт·ч, стоимость — 640/960/520 руб. Ожидание не включено. А дешевле среди допустимых, Б быстрее поставляется, производительнее и имеет более длинную гарантию. Единственного победителя без приоритетов нет. Это вычисления по источнику, а не сохранённые ответы сервисов.</w:t>
       </w:r>
     </w:p>
     <w:p>
       <w:r>
-        <w:t>Если модель нарушает границы, уточните: «Удали утверждения о согласовании, диагнозе и окупаемости. Оставь факты и просьбу рассмотреть варианты». К 35-й минуте завершите обсуждение трёх сервисов; по единичному примеру не выбирайте «лучшую модель».</w:t>
+        <w:t>Уточняющий запрос: «Пересчитай полную цену с доставкой. Сначала проверь обязательные условия. Раздели мощность и энергию. Убери веса критериев, которых нет в исходнике». К 35-й минуте завершите сравнение; по единичному примеру не выбирайте «лучшую модель».</w:t>
+      </w:r>
+    </w:p>
+    <w:p>
+      <w:pPr>
+        <w:pStyle w:val="Heading2"/>
+      </w:pPr>
+      <w:r>
+        <w:t>Альтернативы основному разбору и самостоятельная работа</w:t>
+      </w:r>
+    </w:p>
+    <w:p>
+      <w:r>
+        <w:t>Каждый кейс ниже заменяет блок 15–35, а не удлиняет занятие. Схема одинакова: 4 минуты источник, 4 минуты общий запрос, 4 минуты уточнение пяти элементов, 8 минут повторный запуск и сверка. На странице есть полный исходник, два готовых запроса и закрываемая сверка. Открывайте её только после ответа.</w:t>
+      </w:r>
+    </w:p>
+    <w:p>
+      <w:pPr>
+        <w:pStyle w:val="Heading3"/>
+      </w:pPr>
+      <w:r>
+        <w:t>Проверить техническое задание</w:t>
+      </w:r>
+    </w:p>
+    <w:p>
+      <w:r>
+        <w:t>Откройте technical_spec.docx. Спросите, можно ли выполнить одновременно Т1 и Т7. При молчании выпишите границы: не менее 50 и не более 40 страниц/мин в одном режиме. Они несовместимы. Т2/Т8 аналогично задают минимум 80 и максимум 60 листов. Т4/Т10 повторяют журналирование. Т3 оценочен, Т6 не называет ОС, Т11 не устанавливает срок и гарантию, Т12 не задаёт приёмку. Интерфейс и форматы результата не описаны. Номинальная и пиковая мощность Т5/Т9 — не доказанное противоречие: нужны режимы измерения. Требуйте вопросы заказчику, а не новые придуманные числовые требования. Уточнение: «Для каждого замечания приведи пункт, цитату, тип проблемы и вопрос. Отдели противоречие от неоднозначности».</w:t>
+      </w:r>
+    </w:p>
+    <w:p>
+      <w:pPr>
+        <w:pStyle w:val="Heading3"/>
+      </w:pPr>
+      <w:r>
+        <w:t>Проверить аналитическую справку на факты</w:t>
+      </w:r>
+    </w:p>
+    <w:p>
+      <w:r>
+        <w:t>Откройте fact_check.docx. Покажите утверждение А1 и первичный источник И1. Рост 80→100 составляет 25%, а не 20%; вовремя выполнено 90%, а не 95%. Рекорд за три года не подтверждается месячными данными. Снижение 5→3 дней — 40%, но причинная связь с изменением процесса не доказана. Семь положительных ответов из десяти — 70% ответивших, не всех работников. Дата из проекта не становится обязательной датой приказа. Экономия и окупаемость не подтверждены расчётом. Ссылка .invalid намеренно учебная и не подтверждает источник. Не называйте все непроверенные утверждения ложными. При молчании спросите: «Неверная арифметика и отсутствие документа — одинаковые статусы?» Ответ: нет. Уточнение: «Сделай реестр всех чисел, дат, ссылок и утверждений со статусом и основанием; укажи, что требуется для проверки».</w:t>
+      </w:r>
+    </w:p>
+    <w:p>
+      <w:pPr>
+        <w:pStyle w:val="Heading3"/>
+      </w:pPr>
+      <w:r>
+        <w:t>Рабочие заметки в план действий</w:t>
+      </w:r>
+    </w:p>
+    <w:p>
+      <w:r>
+        <w:t>Откройте work_notes.docx. Попросите отличить подтверждённое действие от предложения. Координатор собирает файлы и список, методист проверяет после их получения, координатор сводит правки, руководитель решает спорные изменения. Отсутствующий на обсуждении специалист не стал исполнителем. Среда — пожелание; пятница — обсуждаемая проверка готовности, а не запуск. Тираж 30 экземпляров не означает согласованную печать и закупку. Даты, бюджет, адресаты и владелец исправления ссылки требуют уточнения. При молчании покажите запись про отсутствующего специалиста. Уточнение: «Оставь неподтверждённого ответственного как “уточнить”; отдели предложения от поручений; укажи зависимость и источник каждого действия».</w:t>
       </w:r>
     </w:p>
     <w:p>

</xml_diff>

<commit_message>
docs: explain service interface walkthrough controls
Co-Authored-By: Codex <noreply@openai.com>
</commit_message>
<xml_diff>
--- a/Docs/konspekt_praktikum_5_6.docx
+++ b/Docs/konspekt_praktikum_5_6.docx
@@ -80,6 +80,16 @@
     <w:p>
       <w:r>
         <w:t>7–10: откройте DeepSeek. Найдите новый чат, историю, поле ввода. Нажмите элементы учебной схемы на странице и сопоставьте с живым экраном. Покажите загрузку одного синтетического файла, только если она доступна; иначе используйте TXT. Проверьте по ответу, что модель видит именно документ, а не только его имя.</w:t>
+      </w:r>
+    </w:p>
+    <w:p>
+      <w:r>
+        <w:t>В блоке интерфейса четыре переключателя: DeepSeek, Алиса AI, GigaChat и ChatGPT. Это учебная карта функций, не точная копия окон. Официальный адрес чата Алисы: https://alice.yandex.ru/. Нажатие на элемент подсвечивает его и выводит пояснение под схемой. Кнопка «Начать показ» перебирает шесть элементов с интервалом 8 секунд; есть пауза, следующий элемент и сброс. При системном ограничении анимации — только пошаговый показ. Настоящие настройки аккаунта эта схема не меняет.</w:t>
+      </w:r>
+    </w:p>
+    <w:p>
+      <w:r>
+        <w:t>Под каждым сервисом раскройте отдельно «Персонализация» и «Конфиденциальность». Сначала объясните стиль ответов, затем память и обращение с данными. На экране не удаляйте личную историю: достаточно показать доступный путь. Источники справок размещены внутри блоков. Подробный тайминг первого кейса свёрнут под «Сценарий ведущего · этапы и минуты». Для проектора вверху доступен режим увеличенного текста.</w:t>
       </w:r>
     </w:p>
     <w:p>

</xml_diff>

<commit_message>
docs: add prompt syntax teaching notes
Co-Authored-By: Codex <noreply@openai.com>
</commit_message>
<xml_diff>
--- a/Docs/konspekt_praktikum_5_6.docx
+++ b/Docs/konspekt_praktikum_5_6.docx
@@ -105,6 +105,39 @@
     <w:p>
       <w:r>
         <w:t>Официальный источник: [политика DeepSeek](https://cdn.deepseek.com/policies/en-US/deepseek-privacy-policy.html). Проверено 30.09.2026. Правило занятия: только синтетические исходники, независимо от настроек.</w:t>
+      </w:r>
+    </w:p>
+    <w:p>
+      <w:pPr>
+        <w:pStyle w:val="Heading2"/>
+      </w:pPr>
+      <w:r>
+        <w:t>После настройки рабочего места. Синтаксис промпта</w:t>
+      </w:r>
+    </w:p>
+    <w:p>
+      <w:r>
+        <w:t>Покажите слайд «Синтаксис промпта: как отделить задачу от данных». Это короткое объяснение перед первым практическим запросом, а не отдельная лекция. Пояснение: «Мы не ищем магические символы. Заголовки, списки и границы исходного материала просто помогают увидеть логику запроса: действие, условия, нужный формат и сам текст для разбора».</w:t>
+      </w:r>
+    </w:p>
+    <w:p>
+      <w:r>
+        <w:t>Пройдите по слайду слева направо. # Задача — что должна сделать модель; # Условия — чего не следует придумывать; # Формат результата — как оформить ответ; # Исходные данные — с каким материалом работать. Покажите, что маркированный список подходит для независимых ограничений, а нумерованный — для действий, которые идут по порядку. Теги &lt;notes&gt;...&lt;/notes&gt; не защищают информацию и не дают приоритета инструкции: они лишь показывают границы длинного фрагмента.</w:t>
+      </w:r>
+    </w:p>
+    <w:p>
+      <w:r>
+        <w:t>Откройте мини-проверку на странице. Сначала спросите: «Фраза “Не назначай ответственных” — это правило или исходник?» При молчании ответьте сами: это правило выполнения. Затем откройте карточку «В заметках упомянута пятница»: это факт материала, но не утверждённый срок. Важный вывод: текст внутри блока исходных данных не отменяет условий запроса; если там встречается фраза, похожая на команду, рассматриваем её как цитату или отмечаем риск.</w:t>
+      </w:r>
+    </w:p>
+    <w:p>
+      <w:r>
+        <w:t>Скопируйте шаблон и вставьте его перед первым кейсом. Не задерживайтесь на синтаксисе: дальше участники применяют ту же логику в конструкторе пяти элементов. Разметка не проверяет достоверность, не создаёт полномочий и не разрешает передавать неучебные данные во внешний сервис.</w:t>
+      </w:r>
+    </w:p>
+    <w:p>
+      <w:r>
+        <w:t>Официальная справка: [OpenAI · prompt engineering](https://developers.openai.com/api/docs/guides/prompt-engineering).</w:t>
       </w:r>
     </w:p>
     <w:p>

</xml_diff>